<commit_message>
Add Zenodo DOI to submission materials
</commit_message>
<xml_diff>
--- a/submission_viruses/HBV_DQB10301_viruses_manuscript.docx
+++ b/submission_viruses/HBV_DQB10301_viruses_manuscript.docx
@@ -3255,15 +3255,15 @@
         <w:rPr>
           <w:rFonts w:ascii="Times New Roman" w:hAnsi="Times New Roman"/>
         </w:rPr>
-        <w:t>https://github.com/llf48/HBV-DQB10301-public-immunogenomics. A frozen Zenodo</w:t>
-      </w:r>
-    </w:p>
-    <w:p>
-      <w:r>
-        <w:rPr>
-          <w:rFonts w:ascii="Times New Roman" w:hAnsi="Times New Roman"/>
-        </w:rPr>
-        <w:t>release DOI should be added before journal submission.</w:t>
+        <w:t>https://github.com/llf48/HBV-DQB10301-public-immunogenomics. A frozen archived</w:t>
+      </w:r>
+    </w:p>
+    <w:p>
+      <w:r>
+        <w:rPr>
+          <w:rFonts w:ascii="Times New Roman" w:hAnsi="Times New Roman"/>
+        </w:rPr>
+        <w:t>release is available at Zenodo: https://doi.org/10.5281/zenodo.19956882.</w:t>
       </w:r>
     </w:p>
     <w:p>

</xml_diff>